<commit_message>
Fix scope notice per teacher's correction
- Remove Neo現代 Unit2 duplication from 出題テキスト
- 入門 problem numbers: 25,26,29,30,33,34,37,38,41,42 (授業分)
  + 27,28,31,32,35 (追加出題)
- 配点: 90点 -> 80点満点 (+Speaking 10+Listening 10 = 100点)
- Add リスニング June 29 note
- Scores: 入門15点, 動画10点, Neo現代Unit2 10点 (not Unit2長文)

https://claude.ai/code/session_015DW3MeoTGzyTVFtzJFvLng
</commit_message>
<xml_diff>
--- a/output/scope_comm2_final.docx
+++ b/output/scope_comm2_final.docx
@@ -74,7 +74,22 @@
           <w:sz w:val="21"/>
           <w:u w:val="none"/>
         </w:rPr>
-        <w:t xml:space="preserve">　　授業で扱ったもの（問題番号　33,34,37,38,41,42）</w:t>
+        <w:t xml:space="preserve">　　授業で扱ったもの（問題番号　25,26,29,30,33,34,37,38,41,42）</w:t>
+      </w:r>
+    </w:p>
+    <w:p>
+      <w:pPr>
+        <w:spacing w:before="0" w:after="0"/>
+        <w:ind w:left="0"/>
+      </w:pPr>
+      <w:r>
+        <w:rPr>
+          <w:rFonts w:eastAsia="MS Mincho" w:ascii="Times New Roman" w:hAnsi="Times New Roman"/>
+          <w:b w:val="0"/>
+          <w:sz w:val="21"/>
+          <w:u w:val="none"/>
+        </w:rPr>
+        <w:t xml:space="preserve">　　※加えて 27,28,31,32,35 からも出題します。</w:t>
       </w:r>
     </w:p>
     <w:p>
@@ -94,21 +109,6 @@
     </w:p>
     <w:p>
       <w:pPr>
-        <w:spacing w:before="0" w:after="0"/>
-        <w:ind w:left="0"/>
-      </w:pPr>
-      <w:r>
-        <w:rPr>
-          <w:rFonts w:eastAsia="MS Mincho" w:ascii="Times New Roman" w:hAnsi="Times New Roman"/>
-          <w:b w:val="0"/>
-          <w:sz w:val="21"/>
-          <w:u w:val="none"/>
-        </w:rPr>
-        <w:t>・Unit 2（授業で扱った長文）</w:t>
-      </w:r>
-    </w:p>
-    <w:p>
-      <w:pPr>
         <w:spacing w:before="200" w:after="40"/>
         <w:ind w:left="0"/>
       </w:pPr>
@@ -121,6 +121,12 @@
         </w:rPr>
         <w:t>出題内容・配点（予定）</w:t>
       </w:r>
+    </w:p>
+    <w:p>
+      <w:pPr>
+        <w:spacing w:before="0" w:after="40"/>
+        <w:ind w:left="0"/>
+      </w:pPr>
       <w:r>
         <w:rPr>
           <w:rFonts w:eastAsia="MS Mincho" w:ascii="Times New Roman" w:hAnsi="Times New Roman"/>
@@ -128,7 +134,22 @@
           <w:sz w:val="21"/>
           <w:u w:val="none"/>
         </w:rPr>
-        <w:t xml:space="preserve">　テストは９０点満点</w:t>
+        <w:t>テストは８０点満点（＋Speaking １０点＋Listening １０点　＝　１００点）</w:t>
+      </w:r>
+    </w:p>
+    <w:p>
+      <w:pPr>
+        <w:spacing w:before="0" w:after="80"/>
+        <w:ind w:left="0"/>
+      </w:pPr>
+      <w:r>
+        <w:rPr>
+          <w:rFonts w:eastAsia="MS Mincho" w:ascii="Times New Roman" w:hAnsi="Times New Roman"/>
+          <w:b w:val="0"/>
+          <w:sz w:val="21"/>
+          <w:u w:val="none"/>
+        </w:rPr>
+        <w:t>※リスニングは６月２９日（月）に実施します。</w:t>
       </w:r>
     </w:p>
     <w:p>
@@ -143,7 +164,7 @@
           <w:sz w:val="21"/>
           <w:u w:val="none"/>
         </w:rPr>
-        <w:t>ワークブック　１０点：</w:t>
+        <w:t>ワークブック　　　　１０点：</w:t>
       </w:r>
       <w:r>
         <w:rPr>
@@ -167,7 +188,7 @@
           <w:sz w:val="21"/>
           <w:u w:val="none"/>
         </w:rPr>
-        <w:t>HearteningⅡ　２０点：</w:t>
+        <w:t>HearteningⅡ　　　　２０点：</w:t>
       </w:r>
       <w:r>
         <w:rPr>
@@ -191,7 +212,7 @@
           <w:sz w:val="21"/>
           <w:u w:val="none"/>
         </w:rPr>
-        <w:t>入門　　　　　１６点：</w:t>
+        <w:t>入門　　　　　　　　１５点：</w:t>
       </w:r>
       <w:r>
         <w:rPr>
@@ -202,7 +223,7 @@
         </w:rPr>
         <w:t xml:space="preserve">　与えられた文に記号を振り構造を示す。それに基づいた日本語訳をする。</w:t>
         <w:br/>
-        <w:t xml:space="preserve">　　　　　　　　　　（＜名詞句・節＞, [形容詞句・節], (副詞句・節)。SVOCM）</w:t>
+        <w:t xml:space="preserve">　　　　　　　　　　　　　（＜名詞句・節＞, [形容詞句・節], (副詞句・節)。SVOCM）</w:t>
       </w:r>
     </w:p>
     <w:p>
@@ -217,7 +238,7 @@
           <w:sz w:val="21"/>
           <w:u w:val="none"/>
         </w:rPr>
-        <w:t>Neo現代　　　１０点：</w:t>
+        <w:t>動画　　　　　　　　１０点：</w:t>
       </w:r>
       <w:r>
         <w:rPr>
@@ -241,7 +262,7 @@
           <w:sz w:val="21"/>
           <w:u w:val="none"/>
         </w:rPr>
-        <w:t>Unit 2　　　　１０点：</w:t>
+        <w:t>Neo現代 Unit2　　　１０点：</w:t>
       </w:r>
       <w:r>
         <w:rPr>
@@ -250,7 +271,7 @@
           <w:sz w:val="21"/>
           <w:u w:val="none"/>
         </w:rPr>
-        <w:t xml:space="preserve">　本文の穴埋め問題（※Unit 2未着手のため要確認）</w:t>
+        <w:t xml:space="preserve">　本文の穴埋め問題</w:t>
       </w:r>
     </w:p>
     <w:p>
@@ -265,7 +286,7 @@
           <w:sz w:val="21"/>
           <w:u w:val="none"/>
         </w:rPr>
-        <w:t>初見問題　　　１５点：</w:t>
+        <w:t>初見問題　　　　　　１５点：</w:t>
       </w:r>
       <w:r>
         <w:rPr>

</xml_diff>